<commit_message>
SCJ resubmission: Vancouver reference renumbering, red/blue marked mainbody, clean previous-version figures, updated response and PRISMA checklist
Co-Authored-By: Tatsuki Onishi <bougtoir@gmail.com>
</commit_message>
<xml_diff>
--- a/wada-tue-scoping-review/manuscripts/SCJ_Response_to_Reviewers.docx
+++ b/wada-tue-scoping-review/manuscripts/SCJ_Response_to_Reviewers.docx
@@ -9,7 +9,7 @@
       <w:r>
         <w:rPr>
           <w:b/>
-          <w:sz w:val="28"/>
+          <w:sz w:val="48"/>
         </w:rPr>
         <w:t>Response to Reviewers</w:t>
       </w:r>
@@ -21,7 +21,7 @@
       <w:r>
         <w:rPr>
           <w:i/>
-          <w:sz w:val="24"/>
+          <w:sz w:val="42"/>
         </w:rPr>
         <w:t>SCJ-D-26-00070: Mind the Gap: A Scoping Review of Discrepancies Between WADA Therapeutic Use Exemptions and Current Clinical Practice Guidelines</w:t>
       </w:r>
@@ -42,17 +42,17 @@
     <w:p>
       <w:r>
         <w:rPr>
-          <w:sz w:val="24"/>
+          <w:sz w:val="42"/>
         </w:rPr>
-        <w:t>We thank the Associate Editor and both reviewers for the constructive and detailed feedback. We have revised the manuscript to address every comment. Major structural changes include: (1) adding page numbers; (2) moving figures and their legends to the end of the manuscript (no embedded figures); (3) moving Source Selection from Results to Methods; (4) placing Recommendations for Harmonization within the Discussion; (5) shortening Practical Applications; and (6) removing the separate Conclusion section. We have also substantially revised the content to provide population/epidemiological context, include WADA perspective throughout, add FDA/EMA/PMDA approval information, explain organic versus functional hypogonadism, address the heart failure/elite-sport issue, and replace PCOS terminology with PMOS while retaining PCOS in parentheses at first use.</w:t>
+        <w:t>We thank the Associate Editor and both reviewers for the constructive and detailed feedback. We have revised the manuscript to address every comment. Major structural changes include: (10) adding page numbers; (5) moving figures and their legends to the end of the manuscript (no embedded figures); (16) moving Source Selection from Results to Methods; (25) placing Recommendations for Harmonization within the Discussion; (6) shortening Practical Applications; and (36) removing the separate Conclusion section. We have also substantially revised the content to provide population/epidemiological context, include WADA perspective throughout, add FDA/EMA/PMDA approval information, explain organic versus functional hypogonadism, address the heart failure/elite-sport issue, and replace PCOS terminology with PMOS while retaining PCOS in parentheses at first use.</w:t>
       </w:r>
     </w:p>
     <w:p>
       <w:r>
         <w:rPr>
-          <w:sz w:val="24"/>
+          <w:sz w:val="42"/>
         </w:rPr>
-        <w:t>All references have been re-verified, renumbered, and alphabetized by lead author per SCJ guidelines. The PRISMA-ScR checklist has been updated and is submitted as a supplementary file. A clean revised manuscript, a marked manuscript (changes shown in red/highlight), and this point-by-point response are provided.</w:t>
+        <w:t>All references have been re-verified and renumbered in order of appearance (Vancouver style). The PRISMA-ScR checklist has been updated and is submitted as a supplementary file. A clean revised manuscript, a marked manuscript (changes shown in red/highlight), and this point-by-point response are provided.</w:t>
       </w:r>
     </w:p>
     <w:p>
@@ -74,14 +74,14 @@
       <w:r>
         <w:rPr>
           <w:b/>
-          <w:sz w:val="22"/>
+          <w:sz w:val="14"/>
         </w:rPr>
         <w:t xml:space="preserve">Comment: </w:t>
       </w:r>
       <w:r>
         <w:rPr>
           <w:i/>
-          <w:sz w:val="22"/>
+          <w:sz w:val="14"/>
         </w:rPr>
         <w:t>Please include page numbers on the resubmission.</w:t>
       </w:r>
@@ -93,13 +93,13 @@
       <w:r>
         <w:rPr>
           <w:b/>
-          <w:sz w:val="22"/>
+          <w:sz w:val="14"/>
         </w:rPr>
         <w:t xml:space="preserve">Response: </w:t>
       </w:r>
       <w:r>
         <w:rPr>
-          <w:sz w:val="22"/>
+          <w:sz w:val="14"/>
         </w:rPr>
         <w:t>Page numbers have been added to the footer of every page.</w:t>
       </w:r>
@@ -112,14 +112,14 @@
       <w:r>
         <w:rPr>
           <w:b/>
-          <w:sz w:val="22"/>
+          <w:sz w:val="14"/>
         </w:rPr>
         <w:t xml:space="preserve">Comment: </w:t>
       </w:r>
       <w:r>
         <w:rPr>
           <w:i/>
-          <w:sz w:val="22"/>
+          <w:sz w:val="14"/>
         </w:rPr>
         <w:t>This scoping review is missing a key element: population (epidemiological data) suggesting that there are people with these diseases/health issues in tested sports.</w:t>
       </w:r>
@@ -131,13 +131,13 @@
       <w:r>
         <w:rPr>
           <w:b/>
-          <w:sz w:val="22"/>
+          <w:sz w:val="14"/>
         </w:rPr>
         <w:t xml:space="preserve">Response: </w:t>
       </w:r>
       <w:r>
         <w:rPr>
-          <w:sz w:val="22"/>
+          <w:sz w:val="14"/>
         </w:rPr>
         <w:t>A new subsection, Population and Epidemiological Context, has been added to Results. It reports 2023 WADA testing figures (288,865 samples across 94 sports/disciplines), athlete asthma prevalence (~20–25%), ADHD prevalence among elite athletes (7–8%), and the expanding masters athlete population (2024 WMA Championships: 8,029 athletes; 2027 World Masters Games: &gt;24,000 registrants).</w:t>
       </w:r>
@@ -150,14 +150,14 @@
       <w:r>
         <w:rPr>
           <w:b/>
-          <w:sz w:val="22"/>
+          <w:sz w:val="14"/>
         </w:rPr>
         <w:t xml:space="preserve">Comment: </w:t>
       </w:r>
       <w:r>
         <w:rPr>
           <w:i/>
-          <w:sz w:val="22"/>
+          <w:sz w:val="14"/>
         </w:rPr>
         <w:t>It seems that the role/responsibilities of S&amp;C professionals would be much lower than that of medical staff... the recommendations at the end are very hard to support.</w:t>
       </w:r>
@@ -169,13 +169,13 @@
       <w:r>
         <w:rPr>
           <w:b/>
-          <w:sz w:val="22"/>
+          <w:sz w:val="14"/>
         </w:rPr>
         <w:t xml:space="preserve">Response: </w:t>
       </w:r>
       <w:r>
         <w:rPr>
-          <w:sz w:val="22"/>
+          <w:sz w:val="14"/>
         </w:rPr>
         <w:t>We have reduced the Practical Applications section to four concise, actionable items and reframed them as support/communication roles rather than clinical decision-making. Recommendations for policy harmonization now appear within the Discussion and are directed at WADA, regulatory bodies, and medical stakeholders, not S&amp;C professionals.</w:t>
       </w:r>
@@ -188,14 +188,14 @@
       <w:r>
         <w:rPr>
           <w:b/>
-          <w:sz w:val="22"/>
+          <w:sz w:val="14"/>
         </w:rPr>
         <w:t xml:space="preserve">Comment: </w:t>
       </w:r>
       <w:r>
         <w:rPr>
           <w:i/>
-          <w:sz w:val="22"/>
+          <w:sz w:val="14"/>
         </w:rPr>
         <w:t>It is not surprising there are gaps. The updates to clinical guidelines are on different timelines than those of TUE.</w:t>
       </w:r>
@@ -207,13 +207,13 @@
       <w:r>
         <w:rPr>
           <w:b/>
-          <w:sz w:val="22"/>
+          <w:sz w:val="14"/>
         </w:rPr>
         <w:t xml:space="preserve">Response: </w:t>
       </w:r>
       <w:r>
         <w:rPr>
-          <w:sz w:val="22"/>
+          <w:sz w:val="14"/>
         </w:rPr>
         <w:t>This point is now explicitly stated in the Cross-Cutting Analysis and Discussion as the first structural driver: temporal mismatch between clinical guideline update cycles and WADA regulatory revisions.</w:t>
       </w:r>
@@ -226,14 +226,14 @@
       <w:r>
         <w:rPr>
           <w:b/>
-          <w:sz w:val="22"/>
+          <w:sz w:val="14"/>
         </w:rPr>
         <w:t xml:space="preserve">Comment: </w:t>
       </w:r>
       <w:r>
         <w:rPr>
           <w:i/>
-          <w:sz w:val="22"/>
+          <w:sz w:val="14"/>
         </w:rPr>
         <w:t>The primary thing missing is FDA/EMA/PMDA guidance... specifically for the newer drugs.</w:t>
       </w:r>
@@ -245,13 +245,13 @@
       <w:r>
         <w:rPr>
           <w:b/>
-          <w:sz w:val="22"/>
+          <w:sz w:val="14"/>
         </w:rPr>
         <w:t xml:space="preserve">Response: </w:t>
       </w:r>
       <w:r>
         <w:rPr>
-          <w:sz w:val="22"/>
+          <w:sz w:val="14"/>
         </w:rPr>
         <w:t>A new paragraph in the Type 2 Diabetes section now lists FDA, EMA, and PMDA approval dates for semaglutide and tirzepatide, with corresponding references.</w:t>
       </w:r>
@@ -264,14 +264,14 @@
       <w:r>
         <w:rPr>
           <w:b/>
-          <w:sz w:val="22"/>
+          <w:sz w:val="14"/>
         </w:rPr>
         <w:t xml:space="preserve">Comment: </w:t>
       </w:r>
       <w:r>
         <w:rPr>
           <w:i/>
-          <w:sz w:val="22"/>
+          <w:sz w:val="14"/>
         </w:rPr>
         <w:t>There has been a recent change to PCOS, it is now PMOS - please correct throughout the manuscript.</w:t>
       </w:r>
@@ -283,13 +283,13 @@
       <w:r>
         <w:rPr>
           <w:b/>
-          <w:sz w:val="22"/>
+          <w:sz w:val="14"/>
         </w:rPr>
         <w:t xml:space="preserve">Response: </w:t>
       </w:r>
       <w:r>
         <w:rPr>
-          <w:sz w:val="22"/>
+          <w:sz w:val="14"/>
         </w:rPr>
         <w:t>We have adopted the proposed term PMOS (polyendocrine metabolic ovarian syndrome) throughout, with PCOS retained in parentheses at first use. All figures and legends have also been updated.</w:t>
       </w:r>
@@ -302,14 +302,14 @@
       <w:r>
         <w:rPr>
           <w:b/>
-          <w:sz w:val="22"/>
+          <w:sz w:val="14"/>
         </w:rPr>
         <w:t xml:space="preserve">Comment: </w:t>
       </w:r>
       <w:r>
         <w:rPr>
           <w:i/>
-          <w:sz w:val="22"/>
+          <w:sz w:val="14"/>
         </w:rPr>
         <w:t>On page 16, you discuss that WADA is permissive, but WADA cares about performance enhancement, which b2 agonists can do.</w:t>
       </w:r>
@@ -321,15 +321,15 @@
       <w:r>
         <w:rPr>
           <w:b/>
-          <w:sz w:val="22"/>
+          <w:sz w:val="14"/>
         </w:rPr>
         <w:t xml:space="preserve">Response: </w:t>
       </w:r>
       <w:r>
         <w:rPr>
-          <w:sz w:val="22"/>
+          <w:sz w:val="14"/>
         </w:rPr>
-        <w:t>The Asthma section now explicitly states WADAs rationale: systemic beta-2 agonists can increase lean body mass and reduce fat mass, and permitted inhaled doses are set below doses associated with these effects. This performance-enhancement rationale is independent of clinical asthma care.</w:t>
+        <w:t>The Asthma section now explicitly states WADA's rationale: systemic beta-2 agonists can increase lean body mass and reduce fat mass, and permitted inhaled doses are set below doses associated with these effects. This performance-enhancement rationale is independent of clinical asthma care.</w:t>
       </w:r>
     </w:p>
     <w:p/>
@@ -340,14 +340,14 @@
       <w:r>
         <w:rPr>
           <w:b/>
-          <w:sz w:val="22"/>
+          <w:sz w:val="14"/>
         </w:rPr>
         <w:t xml:space="preserve">Comment: </w:t>
       </w:r>
       <w:r>
         <w:rPr>
           <w:i/>
-          <w:sz w:val="22"/>
+          <w:sz w:val="14"/>
         </w:rPr>
         <w:t>On pdf page 16 you mention potential compliance risk. Has this happened in the literature or is there any evidence to support it?</w:t>
       </w:r>
@@ -359,13 +359,13 @@
       <w:r>
         <w:rPr>
           <w:b/>
-          <w:sz w:val="22"/>
+          <w:sz w:val="14"/>
         </w:rPr>
         <w:t xml:space="preserve">Response: </w:t>
       </w:r>
       <w:r>
         <w:rPr>
-          <w:sz w:val="22"/>
+          <w:sz w:val="14"/>
         </w:rPr>
         <w:t>We have qualified the statement as a threshold exceedance risk under acute, clinically appropriate dosing during exacerbations, and note that athletes may apply for retroactive TUEs. We do not claim that documented ADRVs are common; rather, the uncertainty and administrative burden itself may influence treatment decisions.</w:t>
       </w:r>
@@ -378,14 +378,14 @@
       <w:r>
         <w:rPr>
           <w:b/>
-          <w:sz w:val="22"/>
+          <w:sz w:val="14"/>
         </w:rPr>
         <w:t xml:space="preserve">Comment: </w:t>
       </w:r>
       <w:r>
         <w:rPr>
           <w:i/>
-          <w:sz w:val="22"/>
+          <w:sz w:val="14"/>
         </w:rPr>
         <w:t>Please provide examples or evidence to support the claim that TUE submissions may be operationally restricted to athletes with elite-level results or prior ADRVs.</w:t>
       </w:r>
@@ -397,13 +397,13 @@
       <w:r>
         <w:rPr>
           <w:b/>
-          <w:sz w:val="22"/>
+          <w:sz w:val="14"/>
         </w:rPr>
         <w:t xml:space="preserve">Response: </w:t>
       </w:r>
       <w:r>
         <w:rPr>
-          <w:sz w:val="22"/>
+          <w:sz w:val="14"/>
         </w:rPr>
         <w:t>We have softened the language and now note that some NADOs require proof of national-team status, international results, or prior anti-doping testing, while others accept applications at any level but impose documentation and processing requirements that function as de facto barriers. We cite athlete-survey and TUE-application literature and explicitly state that systematic eligibility data by competitive tier are limited.</w:t>
       </w:r>
@@ -416,14 +416,14 @@
       <w:r>
         <w:rPr>
           <w:b/>
-          <w:sz w:val="22"/>
+          <w:sz w:val="14"/>
         </w:rPr>
         <w:t xml:space="preserve">Comment: </w:t>
       </w:r>
       <w:r>
         <w:rPr>
           <w:i/>
-          <w:sz w:val="22"/>
+          <w:sz w:val="14"/>
         </w:rPr>
         <w:t>T2D section: GLP-1 RAs are not on the list, so this section seems irrelevant.</w:t>
       </w:r>
@@ -435,13 +435,13 @@
       <w:r>
         <w:rPr>
           <w:b/>
-          <w:sz w:val="22"/>
+          <w:sz w:val="14"/>
         </w:rPr>
         <w:t xml:space="preserve">Response: </w:t>
       </w:r>
       <w:r>
         <w:rPr>
-          <w:sz w:val="22"/>
+          <w:sz w:val="14"/>
         </w:rPr>
         <w:t>The section is retained because GLP-1 receptor agonists are on the WADA Monitoring Program and represent an emerging clinical-competition gap; we note that this is not a current TUE issue but a rapidly evolving one.</w:t>
       </w:r>
@@ -454,14 +454,14 @@
       <w:r>
         <w:rPr>
           <w:b/>
-          <w:sz w:val="22"/>
+          <w:sz w:val="14"/>
         </w:rPr>
         <w:t xml:space="preserve">Comment: </w:t>
       </w:r>
       <w:r>
         <w:rPr>
           <w:i/>
-          <w:sz w:val="22"/>
+          <w:sz w:val="14"/>
         </w:rPr>
         <w:t>Please provide data on the number of athletes who are &gt;40 in sports monitored by regulatory agencies.</w:t>
       </w:r>
@@ -473,13 +473,13 @@
       <w:r>
         <w:rPr>
           <w:b/>
-          <w:sz w:val="22"/>
+          <w:sz w:val="14"/>
         </w:rPr>
         <w:t xml:space="preserve">Response: </w:t>
       </w:r>
       <w:r>
         <w:rPr>
-          <w:sz w:val="22"/>
+          <w:sz w:val="14"/>
         </w:rPr>
         <w:t>The hypogonadism section now cites a study of 183 male athletes over 50 years showing 11.5% severe and 26.2% mild testosterone deficiency. It also provides masters-sport registration data (WMA 2024; World Masters Games 2027) to contextualize the size of the &gt;40 athlete population.</w:t>
       </w:r>
@@ -492,14 +492,14 @@
       <w:r>
         <w:rPr>
           <w:b/>
-          <w:sz w:val="22"/>
+          <w:sz w:val="14"/>
         </w:rPr>
         <w:t xml:space="preserve">Comment: </w:t>
       </w:r>
       <w:r>
         <w:rPr>
           <w:i/>
-          <w:sz w:val="22"/>
+          <w:sz w:val="14"/>
         </w:rPr>
         <w:t>Heart failure? I am fairly certain that is contra-indicated for elite level sport participation.</w:t>
       </w:r>
@@ -511,13 +511,13 @@
       <w:r>
         <w:rPr>
           <w:b/>
-          <w:sz w:val="22"/>
+          <w:sz w:val="14"/>
         </w:rPr>
         <w:t xml:space="preserve">Response: </w:t>
       </w:r>
       <w:r>
         <w:rPr>
-          <w:sz w:val="22"/>
+          <w:sz w:val="14"/>
         </w:rPr>
         <w:t>We now clarify that advanced heart failure generally precludes elite competition, but athletes with earlier-stage or stable heart failure, as well as masters and recreational competitors, may be prescribed MRAs. The example has been revised accordingly.</w:t>
       </w:r>
@@ -530,14 +530,14 @@
       <w:r>
         <w:rPr>
           <w:b/>
-          <w:sz w:val="22"/>
+          <w:sz w:val="14"/>
         </w:rPr>
         <w:t xml:space="preserve">Comment: </w:t>
       </w:r>
       <w:r>
         <w:rPr>
           <w:i/>
-          <w:sz w:val="22"/>
+          <w:sz w:val="14"/>
         </w:rPr>
         <w:t>There is no mention of the biological passport.</w:t>
       </w:r>
@@ -549,13 +549,13 @@
       <w:r>
         <w:rPr>
           <w:b/>
-          <w:sz w:val="22"/>
+          <w:sz w:val="14"/>
         </w:rPr>
         <w:t xml:space="preserve">Response: </w:t>
       </w:r>
       <w:r>
         <w:rPr>
-          <w:sz w:val="22"/>
+          <w:sz w:val="14"/>
         </w:rPr>
         <w:t>The Athlete Biological Passport (ABP) and ADAMS are now introduced in the Cross-Cutting Analysis and their role in longitudinal monitoring and TUE administration is discussed.</w:t>
       </w:r>
@@ -568,14 +568,14 @@
       <w:r>
         <w:rPr>
           <w:b/>
-          <w:sz w:val="22"/>
+          <w:sz w:val="14"/>
         </w:rPr>
         <w:t xml:space="preserve">Comment: </w:t>
       </w:r>
       <w:r>
         <w:rPr>
           <w:i/>
-          <w:sz w:val="22"/>
+          <w:sz w:val="14"/>
         </w:rPr>
         <w:t>The discussion could be shortened substantially - it is very repetitive with the results.</w:t>
       </w:r>
@@ -587,13 +587,13 @@
       <w:r>
         <w:rPr>
           <w:b/>
-          <w:sz w:val="22"/>
+          <w:sz w:val="14"/>
         </w:rPr>
         <w:t xml:space="preserve">Response: </w:t>
       </w:r>
       <w:r>
         <w:rPr>
-          <w:sz w:val="22"/>
+          <w:sz w:val="14"/>
         </w:rPr>
         <w:t>The Discussion has been shortened and reorganized. It now emphasizes synthesis, WADA perspective, ethical implications, and limitations rather than repeating results.</w:t>
       </w:r>
@@ -606,14 +606,14 @@
       <w:r>
         <w:rPr>
           <w:b/>
-          <w:sz w:val="22"/>
+          <w:sz w:val="14"/>
         </w:rPr>
         <w:t xml:space="preserve">Comment: </w:t>
       </w:r>
       <w:r>
         <w:rPr>
           <w:i/>
-          <w:sz w:val="22"/>
+          <w:sz w:val="14"/>
         </w:rPr>
         <w:t>Much like the military and other occupations - it may not be fair that people cannot receive a specific treatment - and that means they cannot compete.</w:t>
       </w:r>
@@ -625,13 +625,13 @@
       <w:r>
         <w:rPr>
           <w:b/>
-          <w:sz w:val="22"/>
+          <w:sz w:val="14"/>
         </w:rPr>
         <w:t xml:space="preserve">Response: </w:t>
       </w:r>
       <w:r>
         <w:rPr>
-          <w:sz w:val="22"/>
+          <w:sz w:val="14"/>
         </w:rPr>
         <w:t>This tension is now acknowledged in the Discussion: anti-doping rules exist because some substances can enhance performance and some athletes misuse them; the clinical-competition gap reflects a necessary trade-off that may limit participation for some athletes.</w:t>
       </w:r>
@@ -644,14 +644,14 @@
       <w:r>
         <w:rPr>
           <w:b/>
-          <w:sz w:val="22"/>
+          <w:sz w:val="14"/>
         </w:rPr>
         <w:t xml:space="preserve">Comment: </w:t>
       </w:r>
       <w:r>
         <w:rPr>
           <w:i/>
-          <w:sz w:val="22"/>
+          <w:sz w:val="14"/>
         </w:rPr>
         <w:t>Figure 1 - please identify the number of studies identified in each database.</w:t>
       </w:r>
@@ -663,13 +663,13 @@
       <w:r>
         <w:rPr>
           <w:b/>
-          <w:sz w:val="22"/>
+          <w:sz w:val="14"/>
         </w:rPr>
         <w:t xml:space="preserve">Response: </w:t>
       </w:r>
       <w:r>
         <w:rPr>
-          <w:sz w:val="22"/>
+          <w:sz w:val="14"/>
         </w:rPr>
         <w:t>Figure 1 now lists database-specific counts in the top identification box (PubMed n=312, Embase n=198, SPORTDiscus n=121, Cochrane n=84, Web of Science n=132, Total n=847), and the legend provides these counts.</w:t>
       </w:r>
@@ -682,14 +682,14 @@
       <w:r>
         <w:rPr>
           <w:b/>
-          <w:sz w:val="22"/>
+          <w:sz w:val="14"/>
         </w:rPr>
         <w:t xml:space="preserve">Comment: </w:t>
       </w:r>
       <w:r>
         <w:rPr>
           <w:i/>
-          <w:sz w:val="22"/>
+          <w:sz w:val="14"/>
         </w:rPr>
         <w:t>Figure 3 - please explain what the gap sensitivity means more clearly.</w:t>
       </w:r>
@@ -701,13 +701,13 @@
       <w:r>
         <w:rPr>
           <w:b/>
-          <w:sz w:val="22"/>
+          <w:sz w:val="14"/>
         </w:rPr>
         <w:t xml:space="preserve">Response: </w:t>
       </w:r>
       <w:r>
         <w:rPr>
-          <w:sz w:val="22"/>
+          <w:sz w:val="14"/>
         </w:rPr>
         <w:t>The Figure 3 legend has been expanded to state that the timeline shows how clinical guideline updates occur on annual or near-annual cycles while WADA TUE guidance and Prohibited List changes may lag by 1–3 years, creating a window of divergence.</w:t>
       </w:r>
@@ -720,14 +720,14 @@
       <w:r>
         <w:rPr>
           <w:b/>
-          <w:sz w:val="22"/>
+          <w:sz w:val="14"/>
         </w:rPr>
         <w:t xml:space="preserve">Comment: </w:t>
       </w:r>
       <w:r>
         <w:rPr>
           <w:i/>
-          <w:sz w:val="22"/>
+          <w:sz w:val="14"/>
         </w:rPr>
         <w:t>Figure 5 - adjust your x-axis so the names can be fully seen.</w:t>
       </w:r>
@@ -739,13 +739,13 @@
       <w:r>
         <w:rPr>
           <w:b/>
-          <w:sz w:val="22"/>
+          <w:sz w:val="14"/>
         </w:rPr>
         <w:t xml:space="preserve">Response: </w:t>
       </w:r>
       <w:r>
         <w:rPr>
-          <w:sz w:val="22"/>
+          <w:sz w:val="14"/>
         </w:rPr>
         <w:t>Figure 5 disease-area labels have been rewritten without line breaks, PCOS has been changed to PMOS, and the x-axis labels are rotated 30 degrees and right-aligned so the full text is visible.</w:t>
       </w:r>
@@ -758,14 +758,14 @@
       <w:r>
         <w:rPr>
           <w:b/>
-          <w:sz w:val="22"/>
+          <w:sz w:val="14"/>
         </w:rPr>
         <w:t xml:space="preserve">Comment: </w:t>
       </w:r>
       <w:r>
         <w:rPr>
           <w:i/>
-          <w:sz w:val="22"/>
+          <w:sz w:val="14"/>
         </w:rPr>
         <w:t>Make sure the prisma checklist is included.</w:t>
       </w:r>
@@ -777,13 +777,13 @@
       <w:r>
         <w:rPr>
           <w:b/>
-          <w:sz w:val="22"/>
+          <w:sz w:val="14"/>
         </w:rPr>
         <w:t xml:space="preserve">Response: </w:t>
       </w:r>
       <w:r>
         <w:rPr>
-          <w:sz w:val="22"/>
+          <w:sz w:val="14"/>
         </w:rPr>
         <w:t>An updated PRISMA-ScR checklist is included as a supplementary file and generated from src/create_prisma_scr_checklist.py.</w:t>
       </w:r>
@@ -808,14 +808,14 @@
       <w:r>
         <w:rPr>
           <w:b/>
-          <w:sz w:val="22"/>
+          <w:sz w:val="14"/>
         </w:rPr>
         <w:t xml:space="preserve">Comment: </w:t>
       </w:r>
       <w:r>
         <w:rPr>
           <w:i/>
-          <w:sz w:val="22"/>
+          <w:sz w:val="14"/>
         </w:rPr>
         <w:t>Add the WADA perspective to create a balanced narrative.</w:t>
       </w:r>
@@ -827,15 +827,15 @@
       <w:r>
         <w:rPr>
           <w:b/>
-          <w:sz w:val="22"/>
+          <w:sz w:val="14"/>
         </w:rPr>
         <w:t xml:space="preserve">Response: </w:t>
       </w:r>
       <w:r>
         <w:rPr>
-          <w:sz w:val="22"/>
+          <w:sz w:val="14"/>
         </w:rPr>
-        <w:t>A dedicated paragraph in the Discussion explicitly acknowledges WADAs mandate to protect clean sport, the role of the Prohibited List, ISTUE, ABP, and ADAMS, and the legitimate rationale for threshold-based and organic-only rules. WADA perspective has also been added to the asthma, ADHD, hypogonadism, cardiovascular, and T2D sections.</w:t>
+        <w:t>A dedicated paragraph in the Discussion explicitly acknowledges WADA's mandate to protect clean sport, the role of the Prohibited List, ISTUE, ABP, and ADAMS, and the legitimate rationale for threshold-based and organic-only rules. WADA perspective has also been added to the asthma, ADHD, hypogonadism, cardiovascular, and T2D sections.</w:t>
       </w:r>
     </w:p>
     <w:p/>
@@ -846,14 +846,14 @@
       <w:r>
         <w:rPr>
           <w:b/>
-          <w:sz w:val="22"/>
+          <w:sz w:val="14"/>
         </w:rPr>
         <w:t xml:space="preserve">Comment: </w:t>
       </w:r>
       <w:r>
         <w:rPr>
           <w:i/>
-          <w:sz w:val="22"/>
+          <w:sz w:val="14"/>
         </w:rPr>
         <w:t>Figure 4 is confusing. Recommend providing an example in the description of how to interpret the figure.</w:t>
       </w:r>
@@ -865,13 +865,13 @@
       <w:r>
         <w:rPr>
           <w:b/>
-          <w:sz w:val="22"/>
+          <w:sz w:val="14"/>
         </w:rPr>
         <w:t xml:space="preserve">Response: </w:t>
       </w:r>
       <w:r>
         <w:rPr>
-          <w:sz w:val="22"/>
+          <w:sz w:val="14"/>
         </w:rPr>
         <w:t>The Figure 4 caption now includes a concrete example (an adult athlete with ADHD on long-acting methylphenidate who would be required to discontinue the medication in-competition without a TUE). The conceptual framework figure itself retains the same structural layout.</w:t>
       </w:r>
@@ -884,14 +884,14 @@
       <w:r>
         <w:rPr>
           <w:b/>
-          <w:sz w:val="22"/>
+          <w:sz w:val="14"/>
         </w:rPr>
         <w:t xml:space="preserve">Comment: </w:t>
       </w:r>
       <w:r>
         <w:rPr>
           <w:i/>
-          <w:sz w:val="22"/>
+          <w:sz w:val="14"/>
         </w:rPr>
         <w:t>Fully spell out the following categories on the X axis of Figure 5: Male..., PCOS/..., and Type 2 Diabetes...</w:t>
       </w:r>
@@ -903,13 +903,13 @@
       <w:r>
         <w:rPr>
           <w:b/>
-          <w:sz w:val="22"/>
+          <w:sz w:val="14"/>
         </w:rPr>
         <w:t xml:space="preserve">Response: </w:t>
       </w:r>
       <w:r>
         <w:rPr>
-          <w:sz w:val="22"/>
+          <w:sz w:val="14"/>
         </w:rPr>
         <w:t>Figure 5 labels are now fully spelled out as "Male Hypogonadism," "PMOS / Fertility," and "Type 2 Diabetes / GLP-1 RA" and are rotated for readability.</w:t>
       </w:r>
@@ -922,14 +922,14 @@
       <w:r>
         <w:rPr>
           <w:b/>
-          <w:sz w:val="22"/>
+          <w:sz w:val="14"/>
         </w:rPr>
         <w:t xml:space="preserve">Comment: </w:t>
       </w:r>
       <w:r>
         <w:rPr>
           <w:i/>
-          <w:sz w:val="22"/>
+          <w:sz w:val="14"/>
         </w:rPr>
         <w:t>Page 1, Line 20: Confirm with editor if key words can be words that appear in the article title.</w:t>
       </w:r>
@@ -941,13 +941,13 @@
       <w:r>
         <w:rPr>
           <w:b/>
-          <w:sz w:val="22"/>
+          <w:sz w:val="14"/>
         </w:rPr>
         <w:t xml:space="preserve">Response: </w:t>
       </w:r>
       <w:r>
         <w:rPr>
-          <w:sz w:val="22"/>
+          <w:sz w:val="14"/>
         </w:rPr>
         <w:t>Keywords were selected from the title and body of the manuscript per SCJ guidance; we are prepared to adjust if the Editorial Office prefers.</w:t>
       </w:r>
@@ -960,14 +960,14 @@
       <w:r>
         <w:rPr>
           <w:b/>
-          <w:sz w:val="22"/>
+          <w:sz w:val="14"/>
         </w:rPr>
         <w:t xml:space="preserve">Comment: </w:t>
       </w:r>
       <w:r>
         <w:rPr>
           <w:i/>
-          <w:sz w:val="22"/>
+          <w:sz w:val="14"/>
         </w:rPr>
         <w:t>Page 2, Line 10: Add "provided such use does not confer an unfair advantage" to the TUE principle sentence.</w:t>
       </w:r>
@@ -979,15 +979,15 @@
       <w:r>
         <w:rPr>
           <w:b/>
-          <w:sz w:val="22"/>
+          <w:sz w:val="14"/>
         </w:rPr>
         <w:t xml:space="preserve">Response: </w:t>
       </w:r>
       <w:r>
         <w:rPr>
-          <w:sz w:val="22"/>
+          <w:sz w:val="14"/>
         </w:rPr>
-        <w:t>The Introduction now states that WADAs objective is to permit appropriate medical care provided the use would produce no additional enhancement beyond a return to normal health and does not confer an unfair advantage.</w:t>
+        <w:t>The Introduction now states that WADA's objective is to permit appropriate medical care provided the use would produce no additional enhancement beyond a return to normal health and does not confer an unfair advantage.</w:t>
       </w:r>
     </w:p>
     <w:p/>
@@ -998,14 +998,14 @@
       <w:r>
         <w:rPr>
           <w:b/>
-          <w:sz w:val="22"/>
+          <w:sz w:val="14"/>
         </w:rPr>
         <w:t xml:space="preserve">Comment: </w:t>
       </w:r>
       <w:r>
         <w:rPr>
           <w:i/>
-          <w:sz w:val="22"/>
+          <w:sz w:val="14"/>
         </w:rPr>
         <w:t>Page 5, Lines 14 &amp; 16: Should National Anti-Doping Organizations and International Federations be capitalized?</w:t>
       </w:r>
@@ -1017,13 +1017,13 @@
       <w:r>
         <w:rPr>
           <w:b/>
-          <w:sz w:val="22"/>
+          <w:sz w:val="14"/>
         </w:rPr>
         <w:t xml:space="preserve">Response: </w:t>
       </w:r>
       <w:r>
         <w:rPr>
-          <w:sz w:val="22"/>
+          <w:sz w:val="14"/>
         </w:rPr>
         <w:t>We have changed these to lower case ("national anti-doping organizations" and "international federations") while retaining the acronyms NADOs and IFs.</w:t>
       </w:r>
@@ -1036,14 +1036,14 @@
       <w:r>
         <w:rPr>
           <w:b/>
-          <w:sz w:val="22"/>
+          <w:sz w:val="14"/>
         </w:rPr>
         <w:t xml:space="preserve">Comment: </w:t>
       </w:r>
       <w:r>
         <w:rPr>
           <w:i/>
-          <w:sz w:val="22"/>
+          <w:sz w:val="14"/>
         </w:rPr>
         <w:t>Page 6, Line 35 / Page 8, Line 23: Are they exclusively international medical organizations or are some on the national level?</w:t>
       </w:r>
@@ -1055,13 +1055,13 @@
       <w:r>
         <w:rPr>
           <w:b/>
-          <w:sz w:val="22"/>
+          <w:sz w:val="14"/>
         </w:rPr>
         <w:t xml:space="preserve">Response: </w:t>
       </w:r>
       <w:r>
         <w:rPr>
-          <w:sz w:val="22"/>
+          <w:sz w:val="14"/>
         </w:rPr>
         <w:t>The Methods eligibility criteria now explicitly include both recognized international and national medical organizations.</w:t>
       </w:r>
@@ -1074,14 +1074,14 @@
       <w:r>
         <w:rPr>
           <w:b/>
-          <w:sz w:val="22"/>
+          <w:sz w:val="14"/>
         </w:rPr>
         <w:t xml:space="preserve">Comment: </w:t>
       </w:r>
       <w:r>
         <w:rPr>
           <w:i/>
-          <w:sz w:val="22"/>
+          <w:sz w:val="14"/>
         </w:rPr>
         <w:t>Confirm if an acronym can start a sentence (WADA).</w:t>
       </w:r>
@@ -1093,13 +1093,13 @@
       <w:r>
         <w:rPr>
           <w:b/>
-          <w:sz w:val="22"/>
+          <w:sz w:val="14"/>
         </w:rPr>
         <w:t xml:space="preserve">Response: </w:t>
       </w:r>
       <w:r>
         <w:rPr>
-          <w:sz w:val="22"/>
+          <w:sz w:val="14"/>
         </w:rPr>
         <w:t>We have revised sentences to avoid starting with WADA as an acronym; the expansion "World Anti-Doping Agency" is used when it begins a sentence.</w:t>
       </w:r>
@@ -1112,14 +1112,14 @@
       <w:r>
         <w:rPr>
           <w:b/>
-          <w:sz w:val="22"/>
+          <w:sz w:val="14"/>
         </w:rPr>
         <w:t xml:space="preserve">Comment: </w:t>
       </w:r>
       <w:r>
         <w:rPr>
           <w:i/>
-          <w:sz w:val="22"/>
+          <w:sz w:val="14"/>
         </w:rPr>
         <w:t>Page 10, Line 21: Confirm wording "...could accumulate 48 μg delivered formoterol daily..."</w:t>
       </w:r>
@@ -1131,13 +1131,13 @@
       <w:r>
         <w:rPr>
           <w:b/>
-          <w:sz w:val="22"/>
+          <w:sz w:val="14"/>
         </w:rPr>
         <w:t xml:space="preserve">Response: </w:t>
       </w:r>
       <w:r>
         <w:rPr>
-          <w:sz w:val="22"/>
+          <w:sz w:val="14"/>
         </w:rPr>
         <w:t>The wording is retained as an illustrative calculation based on a budesonide/formoterol 200/6 μg MART regimen and the 54 μg WADA formoterol threshold.</w:t>
       </w:r>
@@ -1150,14 +1150,14 @@
       <w:r>
         <w:rPr>
           <w:b/>
-          <w:sz w:val="22"/>
+          <w:sz w:val="14"/>
         </w:rPr>
         <w:t xml:space="preserve">Comment: </w:t>
       </w:r>
       <w:r>
         <w:rPr>
           <w:i/>
-          <w:sz w:val="22"/>
+          <w:sz w:val="14"/>
         </w:rPr>
         <w:t>Page 11, Lines 35-43: Include WADA perspective on why ADHD stimulants are allowed out-of-competition but not in-competition.</w:t>
       </w:r>
@@ -1169,15 +1169,15 @@
       <w:r>
         <w:rPr>
           <w:b/>
-          <w:sz w:val="22"/>
+          <w:sz w:val="14"/>
         </w:rPr>
         <w:t xml:space="preserve">Response: </w:t>
       </w:r>
       <w:r>
         <w:rPr>
-          <w:sz w:val="22"/>
+          <w:sz w:val="14"/>
         </w:rPr>
-        <w:t>The ADHD section now explicitly explains WADAs rationale: stimulants may acutely improve alertness and concentration in competition, whereas out-of-competition treatment continuity is permitted because detection windows are shorter and clinical need persists.</w:t>
+        <w:t>The ADHD section now explicitly explains WADA's rationale: stimulants may acutely improve alertness and concentration in competition, whereas out-of-competition treatment continuity is permitted because detection windows are shorter and clinical need persists.</w:t>
       </w:r>
     </w:p>
     <w:p/>
@@ -1188,14 +1188,14 @@
       <w:r>
         <w:rPr>
           <w:b/>
-          <w:sz w:val="22"/>
+          <w:sz w:val="14"/>
         </w:rPr>
         <w:t xml:space="preserve">Comment: </w:t>
       </w:r>
       <w:r>
         <w:rPr>
           <w:i/>
-          <w:sz w:val="22"/>
+          <w:sz w:val="14"/>
         </w:rPr>
         <w:t>Page 13, Line 25: This statement requires a reference to support it.</w:t>
       </w:r>
@@ -1207,15 +1207,15 @@
       <w:r>
         <w:rPr>
           <w:b/>
-          <w:sz w:val="22"/>
+          <w:sz w:val="14"/>
         </w:rPr>
         <w:t xml:space="preserve">Response: </w:t>
       </w:r>
       <w:r>
         <w:rPr>
-          <w:sz w:val="22"/>
+          <w:sz w:val="14"/>
         </w:rPr>
-        <w:t>The statement has been supported with references (23, 32, 34): Overbye and Wagner (23) document how elite athletes experience TUE access as a barrier; Vernec et al. (32) report variation in TUE prevalence across Olympic Games; and WADA's ISTUE (34) establishes the criteria that NADOs and IFs implement with variable practical requirements.</w:t>
+        <w:t>The statement has been supported with references (1, 13, 14): Overbye and Wagner (13) document how elite athletes experience TUE access as a barrier; Vernec et al. (14) report variation in TUE prevalence across Olympic Games; and WADA's ISTUE (1) establishes the criteria that NADOs and IFs implement with variable practical requirements.</w:t>
       </w:r>
     </w:p>
     <w:p/>
@@ -1226,14 +1226,14 @@
       <w:r>
         <w:rPr>
           <w:b/>
-          <w:sz w:val="22"/>
+          <w:sz w:val="14"/>
         </w:rPr>
         <w:t xml:space="preserve">Comment: </w:t>
       </w:r>
       <w:r>
         <w:rPr>
           <w:i/>
-          <w:sz w:val="22"/>
+          <w:sz w:val="14"/>
         </w:rPr>
         <w:t>Page 14: Mention the major increase in GLP-1 medications in overweight/obese populations without diabetes.</w:t>
       </w:r>
@@ -1245,13 +1245,13 @@
       <w:r>
         <w:rPr>
           <w:b/>
-          <w:sz w:val="22"/>
+          <w:sz w:val="14"/>
         </w:rPr>
         <w:t xml:space="preserve">Response: </w:t>
       </w:r>
       <w:r>
         <w:rPr>
-          <w:sz w:val="22"/>
+          <w:sz w:val="14"/>
         </w:rPr>
         <w:t>The T2D section now notes that semaglutide and tirzepatide are also widely used for weight management, which is the basis for WADA surveillance and potential future prohibition in weight-class sports.</w:t>
       </w:r>
@@ -1264,14 +1264,14 @@
       <w:r>
         <w:rPr>
           <w:b/>
-          <w:sz w:val="22"/>
+          <w:sz w:val="14"/>
         </w:rPr>
         <w:t xml:space="preserve">Comment: </w:t>
       </w:r>
       <w:r>
         <w:rPr>
           <w:i/>
-          <w:sz w:val="22"/>
+          <w:sz w:val="14"/>
         </w:rPr>
         <w:t>Page 15, Lines 31 &amp; 33: WADA perspective on testosterone and risk of supraphysiological enhancement.</w:t>
       </w:r>
@@ -1283,15 +1283,15 @@
       <w:r>
         <w:rPr>
           <w:b/>
-          <w:sz w:val="22"/>
+          <w:sz w:val="14"/>
         </w:rPr>
         <w:t xml:space="preserve">Response: </w:t>
       </w:r>
       <w:r>
         <w:rPr>
-          <w:sz w:val="22"/>
+          <w:sz w:val="14"/>
         </w:rPr>
-        <w:t>The hypogonadism section now explicitly states WADAs concern that testosterone restoration can be abused to produce supraphysiological effects, and explains why the organic-only rule seeks to prevent misuse.</w:t>
+        <w:t>The hypogonadism section now explicitly states WADA's concern that testosterone restoration can be abused to produce supraphysiological effects, and explains why the organic-only rule seeks to prevent misuse.</w:t>
       </w:r>
     </w:p>
     <w:p/>
@@ -1302,14 +1302,14 @@
       <w:r>
         <w:rPr>
           <w:b/>
-          <w:sz w:val="22"/>
+          <w:sz w:val="14"/>
         </w:rPr>
         <w:t xml:space="preserve">Comment: </w:t>
       </w:r>
       <w:r>
         <w:rPr>
           <w:i/>
-          <w:sz w:val="22"/>
+          <w:sz w:val="14"/>
         </w:rPr>
         <w:t>Page 16, Line 56: PCOS is now PMOS as of May 12, 2026.</w:t>
       </w:r>
@@ -1321,13 +1321,13 @@
       <w:r>
         <w:rPr>
           <w:b/>
-          <w:sz w:val="22"/>
+          <w:sz w:val="14"/>
         </w:rPr>
         <w:t xml:space="preserve">Response: </w:t>
       </w:r>
       <w:r>
         <w:rPr>
-          <w:sz w:val="22"/>
+          <w:sz w:val="14"/>
         </w:rPr>
         <w:t>We have adopted PMOS (polyendocrine metabolic ovarian syndrome) throughout, with PCOS in parentheses at first use.</w:t>
       </w:r>
@@ -1340,14 +1340,14 @@
       <w:r>
         <w:rPr>
           <w:b/>
-          <w:sz w:val="22"/>
+          <w:sz w:val="14"/>
         </w:rPr>
         <w:t xml:space="preserve">Comment: </w:t>
       </w:r>
       <w:r>
         <w:rPr>
           <w:i/>
-          <w:sz w:val="22"/>
+          <w:sz w:val="14"/>
         </w:rPr>
         <w:t>Page 17, Lines 43 &amp; 45: Explain the difference between organic and functional hypogonadism.</w:t>
       </w:r>
@@ -1359,13 +1359,13 @@
       <w:r>
         <w:rPr>
           <w:b/>
-          <w:sz w:val="22"/>
+          <w:sz w:val="14"/>
         </w:rPr>
         <w:t xml:space="preserve">Response: </w:t>
       </w:r>
       <w:r>
         <w:rPr>
-          <w:sz w:val="22"/>
+          <w:sz w:val="14"/>
         </w:rPr>
         <w:t>A new paragraph defines organic hypogonadism (identifiable hypothalamic-pituitary-gonadal pathology) and functional hypogonadism (age-, obesity-, opioid-, or overtraining-related suppression without a discrete structural lesion).</w:t>
       </w:r>
@@ -1378,16 +1378,16 @@
       <w:r>
         <w:rPr>
           <w:b/>
-          <w:sz w:val="22"/>
+          <w:sz w:val="14"/>
         </w:rPr>
         <w:t xml:space="preserve">Comment: </w:t>
       </w:r>
       <w:r>
         <w:rPr>
           <w:i/>
-          <w:sz w:val="22"/>
+          <w:sz w:val="14"/>
         </w:rPr>
-        <w:t>Page 19, Line 51: Confirm accuracy of reference (9).</w:t>
+        <w:t>Page 19, Line 51: Confirm accuracy of reference (24).</w:t>
       </w:r>
     </w:p>
     <w:p>
@@ -1397,15 +1397,15 @@
       <w:r>
         <w:rPr>
           <w:b/>
-          <w:sz w:val="22"/>
+          <w:sz w:val="14"/>
         </w:rPr>
         <w:t xml:space="preserve">Response: </w:t>
       </w:r>
       <w:r>
         <w:rPr>
-          <w:sz w:val="22"/>
+          <w:sz w:val="14"/>
         </w:rPr>
-        <w:t>Reference (9) is Hostrup et al., a systematic review and meta-analysis of beta-2 agonist performance-enhancing effects, which we now use appropriately in the asthma and discussion sections.</w:t>
+        <w:t>Reference (24) is Hostrup et al., a systematic review and meta-analysis of beta-2 agonist performance-enhancing effects, which we now use appropriately in the asthma and discussion sections.</w:t>
       </w:r>
     </w:p>
     <w:p/>
@@ -1416,16 +1416,16 @@
       <w:r>
         <w:rPr>
           <w:b/>
-          <w:sz w:val="22"/>
+          <w:sz w:val="14"/>
         </w:rPr>
         <w:t xml:space="preserve">Comment: </w:t>
       </w:r>
       <w:r>
         <w:rPr>
           <w:i/>
-          <w:sz w:val="22"/>
+          <w:sz w:val="14"/>
         </w:rPr>
-        <w:t>Page 19, Line 59: Reference (8) and sentence are misleading.</w:t>
+        <w:t>Page 19, Line 59: Reference (12) and sentence are misleading.</w:t>
       </w:r>
     </w:p>
     <w:p>
@@ -1435,15 +1435,15 @@
       <w:r>
         <w:rPr>
           <w:b/>
-          <w:sz w:val="22"/>
+          <w:sz w:val="14"/>
         </w:rPr>
         <w:t xml:space="preserve">Response: </w:t>
       </w:r>
       <w:r>
         <w:rPr>
-          <w:sz w:val="22"/>
+          <w:sz w:val="14"/>
         </w:rPr>
-        <w:t>We have removed the misleading use of Heuberger &amp; Cohen (8) for beta-2 agonists. The asthma section now uses Hostrup et al. (9) for the performance-enhancement rationale and WADA/Allen references for threshold policy.</w:t>
+        <w:t>We have removed the misleading use of Heuberger &amp; Cohen (12) for beta-2 agonists. The asthma section now uses Hostrup et al. (24) for the performance-enhancement rationale and WADA/Allen references for threshold policy.</w:t>
       </w:r>
     </w:p>
     <w:p/>
@@ -1454,14 +1454,14 @@
       <w:r>
         <w:rPr>
           <w:b/>
-          <w:sz w:val="22"/>
+          <w:sz w:val="14"/>
         </w:rPr>
         <w:t xml:space="preserve">Comment: </w:t>
       </w:r>
       <w:r>
         <w:rPr>
           <w:i/>
-          <w:sz w:val="22"/>
+          <w:sz w:val="14"/>
         </w:rPr>
         <w:t>Page 21, Line 31: International Federations capitalization.</w:t>
       </w:r>
@@ -1473,13 +1473,13 @@
       <w:r>
         <w:rPr>
           <w:b/>
-          <w:sz w:val="22"/>
+          <w:sz w:val="14"/>
         </w:rPr>
         <w:t xml:space="preserve">Response: </w:t>
       </w:r>
       <w:r>
         <w:rPr>
-          <w:sz w:val="22"/>
+          <w:sz w:val="14"/>
         </w:rPr>
         <w:t>Changed to lower case.</w:t>
       </w:r>
@@ -1492,14 +1492,14 @@
       <w:r>
         <w:rPr>
           <w:b/>
-          <w:sz w:val="22"/>
+          <w:sz w:val="14"/>
         </w:rPr>
         <w:t xml:space="preserve">Comment: </w:t>
       </w:r>
       <w:r>
         <w:rPr>
           <w:i/>
-          <w:sz w:val="22"/>
+          <w:sz w:val="14"/>
         </w:rPr>
         <w:t>Page 23, Line 7: Use S&amp;C instead of strength and conditioning.</w:t>
       </w:r>
@@ -1511,13 +1511,13 @@
       <w:r>
         <w:rPr>
           <w:b/>
-          <w:sz w:val="22"/>
+          <w:sz w:val="14"/>
         </w:rPr>
         <w:t xml:space="preserve">Response: </w:t>
       </w:r>
       <w:r>
         <w:rPr>
-          <w:sz w:val="22"/>
+          <w:sz w:val="14"/>
         </w:rPr>
         <w:t>All instances have been standardized to S&amp;C after first use.</w:t>
       </w:r>
@@ -1530,14 +1530,14 @@
       <w:r>
         <w:rPr>
           <w:b/>
-          <w:sz w:val="22"/>
+          <w:sz w:val="14"/>
         </w:rPr>
         <w:t xml:space="preserve">Comment: </w:t>
       </w:r>
       <w:r>
         <w:rPr>
           <w:i/>
-          <w:sz w:val="22"/>
+          <w:sz w:val="14"/>
         </w:rPr>
         <w:t>Page 25, Line 49: Spell out ADAMS at first use.</w:t>
       </w:r>
@@ -1549,13 +1549,13 @@
       <w:r>
         <w:rPr>
           <w:b/>
-          <w:sz w:val="22"/>
+          <w:sz w:val="14"/>
         </w:rPr>
         <w:t xml:space="preserve">Response: </w:t>
       </w:r>
       <w:r>
         <w:rPr>
-          <w:sz w:val="22"/>
+          <w:sz w:val="14"/>
         </w:rPr>
         <w:t>The Anti-Doping Administration and Management System (ADAMS) is now spelled out at first use in the Cross-Cutting Analysis.</w:t>
       </w:r>
@@ -1580,14 +1580,14 @@
       <w:r>
         <w:rPr>
           <w:b/>
-          <w:sz w:val="22"/>
+          <w:sz w:val="14"/>
         </w:rPr>
         <w:t xml:space="preserve">Comment: </w:t>
       </w:r>
       <w:r>
         <w:rPr>
           <w:i/>
-          <w:sz w:val="22"/>
+          <w:sz w:val="14"/>
         </w:rPr>
         <w:t>Page 2 – Move the figures to the end of the paper where the figure legends are located.</w:t>
       </w:r>
@@ -1599,13 +1599,13 @@
       <w:r>
         <w:rPr>
           <w:b/>
-          <w:sz w:val="22"/>
+          <w:sz w:val="14"/>
         </w:rPr>
         <w:t xml:space="preserve">Response: </w:t>
       </w:r>
       <w:r>
         <w:rPr>
-          <w:sz w:val="22"/>
+          <w:sz w:val="14"/>
         </w:rPr>
         <w:t>All figures have been removed from the main text. The manuscript now cites figures parenthetically in the text and presents detailed figure legends on a separate page after References.</w:t>
       </w:r>
@@ -1618,14 +1618,14 @@
       <w:r>
         <w:rPr>
           <w:b/>
-          <w:sz w:val="22"/>
+          <w:sz w:val="14"/>
         </w:rPr>
         <w:t xml:space="preserve">Comment: </w:t>
       </w:r>
       <w:r>
         <w:rPr>
           <w:i/>
-          <w:sz w:val="22"/>
+          <w:sz w:val="14"/>
         </w:rPr>
         <w:t>ABSTRACT Line 1 - Put "and the" between (WADA) and Therapeutic.</w:t>
       </w:r>
@@ -1637,13 +1637,13 @@
       <w:r>
         <w:rPr>
           <w:b/>
-          <w:sz w:val="22"/>
+          <w:sz w:val="14"/>
         </w:rPr>
         <w:t xml:space="preserve">Response: </w:t>
       </w:r>
       <w:r>
         <w:rPr>
-          <w:sz w:val="22"/>
+          <w:sz w:val="14"/>
         </w:rPr>
         <w:t>The abstract now reads: "The World Anti-Doping Agency (WADA) and the Therapeutic Use Exemption (TUE) system permit athletes..."</w:t>
       </w:r>
@@ -1656,14 +1656,14 @@
       <w:r>
         <w:rPr>
           <w:b/>
-          <w:sz w:val="22"/>
+          <w:sz w:val="14"/>
         </w:rPr>
         <w:t xml:space="preserve">Comment: </w:t>
       </w:r>
       <w:r>
         <w:rPr>
           <w:i/>
-          <w:sz w:val="22"/>
+          <w:sz w:val="14"/>
         </w:rPr>
         <w:t>INTRODUCTION – You need page numbers.</w:t>
       </w:r>
@@ -1675,13 +1675,13 @@
       <w:r>
         <w:rPr>
           <w:b/>
-          <w:sz w:val="22"/>
+          <w:sz w:val="14"/>
         </w:rPr>
         <w:t xml:space="preserve">Response: </w:t>
       </w:r>
       <w:r>
         <w:rPr>
-          <w:sz w:val="22"/>
+          <w:sz w:val="14"/>
         </w:rPr>
         <w:t>Page numbers have been added to the footer.</w:t>
       </w:r>
@@ -1694,14 +1694,14 @@
       <w:r>
         <w:rPr>
           <w:b/>
-          <w:sz w:val="22"/>
+          <w:sz w:val="14"/>
         </w:rPr>
         <w:t xml:space="preserve">Comment: </w:t>
       </w:r>
       <w:r>
         <w:rPr>
           <w:i/>
-          <w:sz w:val="22"/>
+          <w:sz w:val="14"/>
         </w:rPr>
         <w:t>Page 2, Line 12 – Suggested purpose statement.</w:t>
       </w:r>
@@ -1713,13 +1713,13 @@
       <w:r>
         <w:rPr>
           <w:b/>
-          <w:sz w:val="22"/>
+          <w:sz w:val="14"/>
         </w:rPr>
         <w:t xml:space="preserve">Response: </w:t>
       </w:r>
       <w:r>
         <w:rPr>
-          <w:sz w:val="22"/>
+          <w:sz w:val="14"/>
         </w:rPr>
         <w:t>The purpose statement has been revised for clarity to reflect mapping discrepancies between WADA TUE regulations and clinical practice guidelines and providing practical guidance for S&amp;C professionals.</w:t>
       </w:r>
@@ -1732,14 +1732,14 @@
       <w:r>
         <w:rPr>
           <w:b/>
-          <w:sz w:val="22"/>
+          <w:sz w:val="14"/>
         </w:rPr>
         <w:t xml:space="preserve">Comment: </w:t>
       </w:r>
       <w:r>
         <w:rPr>
           <w:i/>
-          <w:sz w:val="22"/>
+          <w:sz w:val="14"/>
         </w:rPr>
         <w:t>RESULTS - Source Selection should be in Methods.</w:t>
       </w:r>
@@ -1751,13 +1751,13 @@
       <w:r>
         <w:rPr>
           <w:b/>
-          <w:sz w:val="22"/>
+          <w:sz w:val="14"/>
         </w:rPr>
         <w:t xml:space="preserve">Response: </w:t>
       </w:r>
       <w:r>
         <w:rPr>
-          <w:sz w:val="22"/>
+          <w:sz w:val="14"/>
         </w:rPr>
         <w:t>Source Selection has been moved to the Methods section under "Selection of Sources of Evidence."</w:t>
       </w:r>
@@ -1770,14 +1770,14 @@
       <w:r>
         <w:rPr>
           <w:b/>
-          <w:sz w:val="22"/>
+          <w:sz w:val="14"/>
         </w:rPr>
         <w:t xml:space="preserve">Comment: </w:t>
       </w:r>
       <w:r>
         <w:rPr>
           <w:i/>
-          <w:sz w:val="22"/>
+          <w:sz w:val="14"/>
         </w:rPr>
         <w:t>DISCUSSION Line 8 – Change to discrepancies between WADA and TUE.</w:t>
       </w:r>
@@ -1789,13 +1789,13 @@
       <w:r>
         <w:rPr>
           <w:b/>
-          <w:sz w:val="22"/>
+          <w:sz w:val="14"/>
         </w:rPr>
         <w:t xml:space="preserve">Response: </w:t>
       </w:r>
       <w:r>
         <w:rPr>
-          <w:sz w:val="22"/>
+          <w:sz w:val="14"/>
         </w:rPr>
         <w:t>The Discussion opening now reads "...systematic mapping of discrepancies between WADA TUE regulations and current clinical practice guidelines..."</w:t>
       </w:r>
@@ -1808,14 +1808,14 @@
       <w:r>
         <w:rPr>
           <w:b/>
-          <w:sz w:val="22"/>
+          <w:sz w:val="14"/>
         </w:rPr>
         <w:t xml:space="preserve">Comment: </w:t>
       </w:r>
       <w:r>
         <w:rPr>
           <w:i/>
-          <w:sz w:val="22"/>
+          <w:sz w:val="14"/>
         </w:rPr>
         <w:t>PRACTICAL APPLICATIONS - Reduce this section.</w:t>
       </w:r>
@@ -1827,13 +1827,13 @@
       <w:r>
         <w:rPr>
           <w:b/>
-          <w:sz w:val="22"/>
+          <w:sz w:val="14"/>
         </w:rPr>
         <w:t xml:space="preserve">Response: </w:t>
       </w:r>
       <w:r>
         <w:rPr>
-          <w:sz w:val="22"/>
+          <w:sz w:val="14"/>
         </w:rPr>
         <w:t>Practical Applications has been shortened from seven long bullets to four concise, action-oriented recommendations.</w:t>
       </w:r>
@@ -1846,14 +1846,14 @@
       <w:r>
         <w:rPr>
           <w:b/>
-          <w:sz w:val="22"/>
+          <w:sz w:val="14"/>
         </w:rPr>
         <w:t xml:space="preserve">Comment: </w:t>
       </w:r>
       <w:r>
         <w:rPr>
           <w:i/>
-          <w:sz w:val="22"/>
+          <w:sz w:val="14"/>
         </w:rPr>
         <w:t>RECOMMENDATIONS FOR HARMONIZATION should be in the Discussion.</w:t>
       </w:r>
@@ -1865,13 +1865,13 @@
       <w:r>
         <w:rPr>
           <w:b/>
-          <w:sz w:val="22"/>
+          <w:sz w:val="14"/>
         </w:rPr>
         <w:t xml:space="preserve">Response: </w:t>
       </w:r>
       <w:r>
         <w:rPr>
-          <w:sz w:val="22"/>
+          <w:sz w:val="14"/>
         </w:rPr>
         <w:t>Recommendations for Harmonization now appear as a subsection within the Discussion.</w:t>
       </w:r>
@@ -1884,14 +1884,14 @@
       <w:r>
         <w:rPr>
           <w:b/>
-          <w:sz w:val="22"/>
+          <w:sz w:val="14"/>
         </w:rPr>
         <w:t xml:space="preserve">Comment: </w:t>
       </w:r>
       <w:r>
         <w:rPr>
           <w:i/>
-          <w:sz w:val="22"/>
+          <w:sz w:val="14"/>
         </w:rPr>
         <w:t>Omit the Conclusions.</w:t>
       </w:r>
@@ -1903,13 +1903,13 @@
       <w:r>
         <w:rPr>
           <w:b/>
-          <w:sz w:val="22"/>
+          <w:sz w:val="14"/>
         </w:rPr>
         <w:t xml:space="preserve">Response: </w:t>
       </w:r>
       <w:r>
         <w:rPr>
-          <w:sz w:val="22"/>
+          <w:sz w:val="14"/>
         </w:rPr>
         <w:t>The separate Conclusion section has been removed; concluding points are integrated into the final paragraphs of the Discussion.</w:t>
       </w:r>

</xml_diff>

<commit_message>
SCJ editor resubmission: alphabetical references, figure call-outs, marked mainbody
Co-Authored-By: Tatsuki Onishi <bougtoir@gmail.com>
</commit_message>
<xml_diff>
--- a/wada-tue-scoping-review/manuscripts/SCJ_Response_to_Reviewers.docx
+++ b/wada-tue-scoping-review/manuscripts/SCJ_Response_to_Reviewers.docx
@@ -52,7 +52,7 @@
         <w:rPr>
           <w:sz w:val="42"/>
         </w:rPr>
-        <w:t>All references have been re-verified and renumbered in order of appearance (Vancouver style). The PRISMA-ScR checklist has been updated and is submitted as a supplementary file. A clean revised manuscript, a marked manuscript (changes shown in red/highlight), and this point-by-point response are provided.</w:t>
+        <w:t>All references have been re-verified and renumbered alphabetically (AMA style) per SCJ guidelines. The PRISMA-ScR checklist has been updated and is submitted as a supplementary file. A clean revised manuscript, a marked manuscript (deletions shown in blue strikethrough, insertions shown in red), and this point-by-point response are provided.</w:t>
       </w:r>
     </w:p>
     <w:p>
@@ -1215,7 +1215,7 @@
         <w:rPr>
           <w:sz w:val="14"/>
         </w:rPr>
-        <w:t>The statement has been supported with references (1, 13, 14): Overbye and Wagner (13) document how elite athletes experience TUE access as a barrier; Vernec et al. (14) report variation in TUE prevalence across Olympic Games; and WADA's ISTUE (1) establishes the criteria that NADOs and IFs implement with variable practical requirements.</w:t>
+        <w:t>The statement has been supported with references (43, 23, 32): Overbye and Wagner (23) document how elite athletes experience TUE access as a barrier; Vernec et al. (32) report variation in TUE prevalence across Olympic Games; and WADA's ISTUE (43) establishes the criteria that NADOs and IFs implement with variable practical requirements.</w:t>
       </w:r>
     </w:p>
     <w:p/>
@@ -1405,7 +1405,7 @@
         <w:rPr>
           <w:sz w:val="14"/>
         </w:rPr>
-        <w:t>Reference (24) is Hostrup et al., a systematic review and meta-analysis of beta-2 agonist performance-enhancing effects, which we now use appropriately in the asthma and discussion sections.</w:t>
+        <w:t>Reference (14) is Hostrup et al., a systematic review and meta-analysis of beta-2 agonist performance-enhancing effects, which we now use appropriately in the asthma and discussion sections.</w:t>
       </w:r>
     </w:p>
     <w:p/>
@@ -1443,7 +1443,7 @@
         <w:rPr>
           <w:sz w:val="14"/>
         </w:rPr>
-        <w:t>We have removed the misleading use of Heuberger &amp; Cohen (12) for beta-2 agonists. The asthma section now uses Hostrup et al. (24) for the performance-enhancement rationale and WADA/Allen references for threshold policy.</w:t>
+        <w:t>We have removed the misleading use of Heuberger &amp; Cohen (13) for beta-2 agonists. The asthma section now uses Hostrup et al. (14) for the performance-enhancement rationale and WADA/Allen references for threshold policy.</w:t>
       </w:r>
     </w:p>
     <w:p/>

</xml_diff>